<commit_message>
phisics lab 1.05 final
</commit_message>
<xml_diff>
--- a/Phisics/P3210_Полуянов И.А._1.05.docx
+++ b/Phisics/P3210_Полуянов И.А._1.05.docx
@@ -103,18 +103,8 @@
           <w:b/>
           <w:sz w:val="18"/>
         </w:rPr>
-        <w:t xml:space="preserve">Физико-технический </w:t>
-      </w:r>
-      <w:proofErr w:type="spellStart"/>
-      <w:r>
-        <w:rPr>
-          <w:rFonts w:ascii="Corbel" w:hAnsi="Corbel"/>
-          <w:b/>
-          <w:sz w:val="18"/>
-        </w:rPr>
-        <w:t>мегафакультет</w:t>
-      </w:r>
-      <w:proofErr w:type="spellEnd"/>
+        <w:t>Физико-технический мегафакультет</w:t>
+      </w:r>
       <w:r>
         <w:rPr>
           <w:rFonts w:ascii="Corbel" w:hAnsi="Corbel"/>
@@ -4281,21 +4271,7 @@
                   <w:rFonts w:ascii="Cambria Math" w:hAnsi="Cambria Math" w:cs="Times New Roman"/>
                   <w:lang w:val="en-US"/>
                 </w:rPr>
-                <m:t>+18,</m:t>
-              </m:r>
-              <m:r>
-                <w:rPr>
-                  <w:rFonts w:ascii="Cambria Math" w:hAnsi="Cambria Math" w:cs="Times New Roman"/>
-                  <w:lang w:val="en-US"/>
-                </w:rPr>
-                <m:t>5</m:t>
-              </m:r>
-              <m:r>
-                <w:rPr>
-                  <w:rFonts w:ascii="Cambria Math" w:hAnsi="Cambria Math" w:cs="Times New Roman"/>
-                  <w:lang w:val="en-US"/>
-                </w:rPr>
-                <m:t>+18,6</m:t>
+                <m:t>+18,5+18,6</m:t>
               </m:r>
               <m:ctrlPr>
                 <w:rPr>
@@ -4327,26 +4303,13 @@
               <w:rFonts w:ascii="Cambria Math" w:hAnsi="Cambria Math" w:cs="Times New Roman"/>
               <w:lang w:val="en-US"/>
             </w:rPr>
-            <m:t>=18,</m:t>
-          </m:r>
-          <m:r>
-            <w:rPr>
-              <w:rFonts w:ascii="Cambria Math" w:hAnsi="Cambria Math" w:cs="Times New Roman"/>
-              <w:lang w:val="en-US"/>
-            </w:rPr>
-            <m:t>23</m:t>
+            <m:t>=18,23</m:t>
           </m:r>
           <m:r>
             <w:rPr>
               <w:rFonts w:ascii="Cambria Math" w:hAnsi="Cambria Math" w:cs="Times New Roman"/>
             </w:rPr>
-            <m:t>3</m:t>
-          </m:r>
-          <m:r>
-            <w:rPr>
-              <w:rFonts w:ascii="Cambria Math" w:hAnsi="Cambria Math" w:cs="Times New Roman"/>
-            </w:rPr>
-            <m:t xml:space="preserve"> с.</m:t>
+            <m:t>3 с.</m:t>
           </m:r>
         </m:oMath>
       </m:oMathPara>
@@ -4468,14 +4431,7 @@
                   <w:rFonts w:ascii="Cambria Math" w:hAnsi="Cambria Math" w:cs="Times New Roman"/>
                   <w:lang w:val="en-US"/>
                 </w:rPr>
-                <m:t>18,</m:t>
-              </m:r>
-              <m:r>
-                <w:rPr>
-                  <w:rFonts w:ascii="Cambria Math" w:hAnsi="Cambria Math" w:cs="Times New Roman"/>
-                  <w:lang w:val="en-US"/>
-                </w:rPr>
-                <m:t>2</m:t>
+                <m:t>18,2</m:t>
               </m:r>
               <m:r>
                 <w:rPr>
@@ -4513,14 +4469,7 @@
               <w:rFonts w:ascii="Cambria Math" w:hAnsi="Cambria Math" w:cs="Times New Roman"/>
               <w:lang w:val="en-US"/>
             </w:rPr>
-            <m:t>=1,8</m:t>
-          </m:r>
-          <m:r>
-            <w:rPr>
-              <w:rFonts w:ascii="Cambria Math" w:hAnsi="Cambria Math" w:cs="Times New Roman"/>
-              <w:lang w:val="en-US"/>
-            </w:rPr>
-            <m:t>2</m:t>
+            <m:t>=1,82</m:t>
           </m:r>
           <m:r>
             <w:rPr>
@@ -5744,14 +5693,7 @@
                   <w:rFonts w:ascii="Cambria Math" w:hAnsi="Cambria Math" w:cs="Times New Roman"/>
                   <w:lang w:val="en-US"/>
                 </w:rPr>
-                <m:t>+4</m:t>
-              </m:r>
-              <m:r>
-                <w:rPr>
-                  <w:rFonts w:ascii="Cambria Math" w:hAnsi="Cambria Math" w:cs="Times New Roman"/>
-                  <w:lang w:val="en-US"/>
-                </w:rPr>
-                <m:t>5</m:t>
+                <m:t>+45</m:t>
               </m:r>
               <m:r>
                 <w:rPr>
@@ -5764,14 +5706,7 @@
                   <w:rFonts w:ascii="Cambria Math" w:hAnsi="Cambria Math" w:cs="Times New Roman"/>
                   <w:lang w:val="en-US"/>
                 </w:rPr>
-                <m:t>+4</m:t>
-              </m:r>
-              <m:r>
-                <w:rPr>
-                  <w:rFonts w:ascii="Cambria Math" w:hAnsi="Cambria Math" w:cs="Times New Roman"/>
-                  <w:lang w:val="en-US"/>
-                </w:rPr>
-                <m:t>5</m:t>
+                <m:t>+45</m:t>
               </m:r>
               <m:r>
                 <w:rPr>
@@ -5809,35 +5744,7 @@
               <w:rFonts w:ascii="Cambria Math" w:hAnsi="Cambria Math" w:cs="Times New Roman"/>
               <w:lang w:val="en-US"/>
             </w:rPr>
-            <m:t>=4</m:t>
-          </m:r>
-          <m:r>
-            <w:rPr>
-              <w:rFonts w:ascii="Cambria Math" w:hAnsi="Cambria Math" w:cs="Times New Roman"/>
-              <w:lang w:val="en-US"/>
-            </w:rPr>
-            <m:t>4</m:t>
-          </m:r>
-          <m:r>
-            <w:rPr>
-              <w:rFonts w:ascii="Cambria Math" w:hAnsi="Cambria Math" w:cs="Times New Roman"/>
-              <w:lang w:val="en-US"/>
-            </w:rPr>
-            <m:t>,</m:t>
-          </m:r>
-          <m:r>
-            <w:rPr>
-              <w:rFonts w:ascii="Cambria Math" w:hAnsi="Cambria Math" w:cs="Times New Roman"/>
-              <w:lang w:val="en-US"/>
-            </w:rPr>
-            <m:t>7</m:t>
-          </m:r>
-          <m:r>
-            <w:rPr>
-              <w:rFonts w:ascii="Cambria Math" w:hAnsi="Cambria Math" w:cs="Times New Roman"/>
-              <w:lang w:val="en-US"/>
-            </w:rPr>
-            <m:t>5</m:t>
+            <m:t>=44,75</m:t>
           </m:r>
           <m:r>
             <w:rPr>
@@ -7306,21 +7213,7 @@
               <w:rFonts w:ascii="Cambria Math" w:hAnsi="Cambria Math" w:cs="Times New Roman"/>
               <w:lang w:val="en-US"/>
             </w:rPr>
-            <m:t>=</m:t>
-          </m:r>
-          <m:r>
-            <w:rPr>
-              <w:rFonts w:ascii="Cambria Math" w:hAnsi="Cambria Math" w:cs="Times New Roman"/>
-              <w:lang w:val="en-US"/>
-            </w:rPr>
-            <m:t>1,</m:t>
-          </m:r>
-          <m:r>
-            <w:rPr>
-              <w:rFonts w:ascii="Cambria Math" w:hAnsi="Cambria Math" w:cs="Times New Roman"/>
-              <w:lang w:val="en-US"/>
-            </w:rPr>
-            <m:t>4</m:t>
+            <m:t>=1,4</m:t>
           </m:r>
           <m:r>
             <w:rPr>
@@ -7643,7 +7536,6 @@
                 <w:szCs w:val="22"/>
               </w:rPr>
             </w:pPr>
-            <w:proofErr w:type="spellStart"/>
             <w:r>
               <w:rPr>
                 <w:rFonts w:ascii="Calibri" w:hAnsi="Calibri" w:cs="Calibri"/>
@@ -7653,19 +7545,7 @@
                 <w:sz w:val="22"/>
                 <w:szCs w:val="22"/>
               </w:rPr>
-              <w:t>ln</w:t>
-            </w:r>
-            <w:proofErr w:type="spellEnd"/>
-            <w:r>
-              <w:rPr>
-                <w:rFonts w:ascii="Calibri" w:hAnsi="Calibri" w:cs="Calibri"/>
-                <w:b/>
-                <w:bCs/>
-                <w:color w:val="000000"/>
-                <w:sz w:val="22"/>
-                <w:szCs w:val="22"/>
-              </w:rPr>
-              <w:t>(A/A</w:t>
+              <w:t>ln(A/A</w:t>
             </w:r>
             <w:r>
               <w:rPr>
@@ -8637,19 +8517,7 @@
             <w:rPr>
               <w:rFonts w:ascii="Cambria Math" w:hAnsi="Cambria Math"/>
             </w:rPr>
-            <m:t>=0,0023</m:t>
-          </m:r>
-          <m:r>
-            <w:rPr>
-              <w:rFonts w:ascii="Cambria Math" w:hAnsi="Cambria Math"/>
-            </w:rPr>
-            <m:t>9</m:t>
-          </m:r>
-          <m:r>
-            <w:rPr>
-              <w:rFonts w:ascii="Cambria Math" w:hAnsi="Cambria Math"/>
-            </w:rPr>
-            <m:t xml:space="preserve"> </m:t>
+            <m:t xml:space="preserve">=0,00239 </m:t>
           </m:r>
           <m:sSup>
             <m:sSupPr>
@@ -8735,13 +8603,7 @@
             <w:rPr>
               <w:rFonts w:ascii="Cambria Math" w:hAnsi="Cambria Math"/>
             </w:rPr>
-            <m:t>=4</m:t>
-          </m:r>
-          <m:r>
-            <w:rPr>
-              <w:rFonts w:ascii="Cambria Math" w:hAnsi="Cambria Math"/>
-            </w:rPr>
-            <m:t>1</m:t>
+            <m:t>=41</m:t>
           </m:r>
           <m:r>
             <w:rPr>
@@ -9073,7 +8935,6 @@
                 <w:color w:val="000000"/>
               </w:rPr>
             </w:pPr>
-            <w:proofErr w:type="spellStart"/>
             <w:r>
               <w:rPr>
                 <w:color w:val="000000"/>
@@ -9087,7 +8948,6 @@
               </w:rPr>
               <w:t>верх</w:t>
             </w:r>
-            <w:proofErr w:type="spellEnd"/>
             <w:r>
               <w:rPr>
                 <w:color w:val="000000"/>
@@ -9151,7 +9011,6 @@
                 <w:color w:val="000000"/>
               </w:rPr>
             </w:pPr>
-            <w:proofErr w:type="spellStart"/>
             <w:r>
               <w:rPr>
                 <w:color w:val="000000"/>
@@ -9165,7 +9024,6 @@
               </w:rPr>
               <w:t>нижн</w:t>
             </w:r>
-            <w:proofErr w:type="spellEnd"/>
             <w:r>
               <w:rPr>
                 <w:color w:val="000000"/>
@@ -9229,7 +9087,6 @@
                 <w:color w:val="000000"/>
               </w:rPr>
             </w:pPr>
-            <w:proofErr w:type="spellStart"/>
             <w:r>
               <w:rPr>
                 <w:color w:val="000000"/>
@@ -9243,7 +9100,6 @@
               </w:rPr>
               <w:t>бок</w:t>
             </w:r>
-            <w:proofErr w:type="spellEnd"/>
             <w:r>
               <w:rPr>
                 <w:color w:val="000000"/>
@@ -9437,7 +9293,6 @@
                 <w:vertAlign w:val="superscript"/>
               </w:rPr>
             </w:pPr>
-            <w:proofErr w:type="spellStart"/>
             <w:r>
               <w:rPr>
                 <w:color w:val="000000"/>
@@ -9451,7 +9306,6 @@
               </w:rPr>
               <w:t>гр</w:t>
             </w:r>
-            <w:proofErr w:type="spellEnd"/>
             <w:r>
               <w:rPr>
                 <w:color w:val="000000"/>
@@ -9899,7 +9753,6 @@
                 <w:color w:val="000000"/>
               </w:rPr>
             </w:pPr>
-            <w:proofErr w:type="spellStart"/>
             <w:r>
               <w:rPr>
                 <w:color w:val="000000"/>
@@ -9911,15 +9764,7 @@
                 <w:color w:val="000000"/>
                 <w:vertAlign w:val="subscript"/>
               </w:rPr>
-              <w:t>пр</w:t>
-            </w:r>
-            <w:proofErr w:type="spellEnd"/>
-            <w:r>
-              <w:rPr>
-                <w:color w:val="000000"/>
-                <w:vertAlign w:val="subscript"/>
-              </w:rPr>
-              <w:t xml:space="preserve"> эксп</w:t>
+              <w:t>пр эксп</w:t>
             </w:r>
             <w:r>
               <w:rPr>
@@ -10123,7 +9968,6 @@
                 <w:color w:val="000000"/>
               </w:rPr>
             </w:pPr>
-            <w:proofErr w:type="spellStart"/>
             <w:r>
               <w:rPr>
                 <w:color w:val="000000"/>
@@ -10135,25 +9979,8 @@
                 <w:color w:val="000000"/>
                 <w:vertAlign w:val="subscript"/>
               </w:rPr>
-              <w:t>пр</w:t>
-            </w:r>
-            <w:proofErr w:type="spellEnd"/>
-            <w:r>
-              <w:rPr>
-                <w:color w:val="000000"/>
-                <w:vertAlign w:val="subscript"/>
-              </w:rPr>
-              <w:t xml:space="preserve"> </w:t>
-            </w:r>
-            <w:proofErr w:type="spellStart"/>
-            <w:r>
-              <w:rPr>
-                <w:color w:val="000000"/>
-                <w:vertAlign w:val="subscript"/>
-              </w:rPr>
-              <w:t>теор</w:t>
-            </w:r>
-            <w:proofErr w:type="spellEnd"/>
+              <w:t>пр теор</w:t>
+            </w:r>
             <w:r>
               <w:rPr>
                 <w:color w:val="000000"/>
@@ -10409,7 +10236,6 @@
         </w:rPr>
         <w:t>m</w:t>
       </w:r>
-      <w:proofErr w:type="spellStart"/>
       <w:proofErr w:type="gramStart"/>
       <w:r>
         <w:rPr>
@@ -10420,7 +10246,6 @@
         </w:rPr>
         <w:t>гр</w:t>
       </w:r>
-      <w:proofErr w:type="spellEnd"/>
       <w:r>
         <w:rPr>
           <w:rFonts w:ascii="Times New Roman" w:hAnsi="Times New Roman" w:cs="Times New Roman"/>
@@ -10482,7 +10307,6 @@
         </w:rPr>
         <w:t>R</w:t>
       </w:r>
-      <w:proofErr w:type="spellStart"/>
       <w:r>
         <w:rPr>
           <w:rFonts w:ascii="Times New Roman" w:hAnsi="Times New Roman" w:cs="Times New Roman"/>
@@ -10492,7 +10316,6 @@
         </w:rPr>
         <w:t>ниж</w:t>
       </w:r>
-      <w:proofErr w:type="spellEnd"/>
       <w:r>
         <w:rPr>
           <w:rFonts w:ascii="Times New Roman" w:hAnsi="Times New Roman" w:cs="Times New Roman"/>
@@ -10761,7 +10584,6 @@
         </w:rPr>
         <w:t xml:space="preserve"> = I</w:t>
       </w:r>
-      <w:proofErr w:type="spellStart"/>
       <w:r>
         <w:rPr>
           <w:rFonts w:ascii="Times New Roman" w:hAnsi="Times New Roman" w:cs="Times New Roman"/>
@@ -10771,7 +10593,6 @@
         </w:rPr>
         <w:t>гр</w:t>
       </w:r>
-      <w:proofErr w:type="spellEnd"/>
       <w:r>
         <w:rPr>
           <w:rFonts w:ascii="Times New Roman" w:hAnsi="Times New Roman" w:cs="Times New Roman"/>
@@ -11964,7 +11785,21 @@
           <w:rFonts w:ascii="Times New Roman" w:hAnsi="Times New Roman" w:cs="Times New Roman"/>
           <w:i/>
         </w:rPr>
-        <w:t>Рис. 1 – График зависимости амплитуды от времени</w:t>
+        <w:t xml:space="preserve">Рис. </w:t>
+      </w:r>
+      <w:r>
+        <w:rPr>
+          <w:rFonts w:ascii="Times New Roman" w:hAnsi="Times New Roman" w:cs="Times New Roman"/>
+          <w:i/>
+        </w:rPr>
+        <w:t>2</w:t>
+      </w:r>
+      <w:r>
+        <w:rPr>
+          <w:rFonts w:ascii="Times New Roman" w:hAnsi="Times New Roman" w:cs="Times New Roman"/>
+          <w:i/>
+        </w:rPr>
+        <w:t xml:space="preserve"> – График зависимости амплитуды от времени</w:t>
       </w:r>
     </w:p>
     <w:p>
@@ -12016,7 +11851,21 @@
           <w:rFonts w:ascii="Times New Roman" w:hAnsi="Times New Roman" w:cs="Times New Roman"/>
           <w:i/>
         </w:rPr>
-        <w:t xml:space="preserve">Рис. 2 – График, соответствующий формуле </w:t>
+        <w:t xml:space="preserve">Рис. </w:t>
+      </w:r>
+      <w:r>
+        <w:rPr>
+          <w:rFonts w:ascii="Times New Roman" w:hAnsi="Times New Roman" w:cs="Times New Roman"/>
+          <w:i/>
+        </w:rPr>
+        <w:t>3</w:t>
+      </w:r>
+      <w:r>
+        <w:rPr>
+          <w:rFonts w:ascii="Times New Roman" w:hAnsi="Times New Roman" w:cs="Times New Roman"/>
+          <w:i/>
+        </w:rPr>
+        <w:t xml:space="preserve"> – График, соответствующий формуле </w:t>
       </w:r>
       <m:oMath>
         <m:r>
@@ -12095,7 +11944,7 @@
         </w:rPr>
         <w:lastRenderedPageBreak/>
         <w:drawing>
-          <wp:inline distT="0" distB="0" distL="0" distR="0" wp14:anchorId="5EAC4211" wp14:editId="138DBABA">
+          <wp:inline distT="0" distB="0" distL="0" distR="0" wp14:anchorId="5EAC4211" wp14:editId="7C09BFB4">
             <wp:extent cx="4111975" cy="3818989"/>
             <wp:effectExtent l="0" t="0" r="3175" b="10160"/>
             <wp:docPr id="1241377936" name="Диаграмма 1">
@@ -12132,7 +11981,23 @@
           <w:i/>
           <w:iCs/>
         </w:rPr>
-        <w:t>Рис. 3 – График зависимости квадрата периода от момента инерции</w:t>
+        <w:t xml:space="preserve">Рис. </w:t>
+      </w:r>
+      <w:r>
+        <w:rPr>
+          <w:rFonts w:ascii="Times New Roman" w:hAnsi="Times New Roman" w:cs="Times New Roman"/>
+          <w:i/>
+          <w:iCs/>
+        </w:rPr>
+        <w:t>4</w:t>
+      </w:r>
+      <w:r>
+        <w:rPr>
+          <w:rFonts w:ascii="Times New Roman" w:hAnsi="Times New Roman" w:cs="Times New Roman"/>
+          <w:i/>
+          <w:iCs/>
+        </w:rPr>
+        <w:t xml:space="preserve"> – График зависимости квадрата периода от момента инерции</w:t>
       </w:r>
     </w:p>
     <w:p>
@@ -12470,7 +12335,6 @@
                 <w:vertAlign w:val="superscript"/>
               </w:rPr>
             </w:pPr>
-            <w:proofErr w:type="spellStart"/>
             <w:r>
               <w:rPr>
                 <w:color w:val="000000"/>
@@ -12482,15 +12346,7 @@
                 <w:color w:val="000000"/>
                 <w:vertAlign w:val="subscript"/>
               </w:rPr>
-              <w:t>пр</w:t>
-            </w:r>
-            <w:proofErr w:type="spellEnd"/>
-            <w:r>
-              <w:rPr>
-                <w:color w:val="000000"/>
-                <w:vertAlign w:val="subscript"/>
-              </w:rPr>
-              <w:t xml:space="preserve"> эксп</w:t>
+              <w:t>пр эксп</w:t>
             </w:r>
             <w:r>
               <w:rPr>
@@ -12503,14 +12359,7 @@
               <w:rPr>
                 <w:color w:val="000000"/>
               </w:rPr>
-              <w:t>кг/м</w:t>
-            </w:r>
-            <w:r>
-              <w:rPr>
-                <w:color w:val="000000"/>
-                <w:vertAlign w:val="superscript"/>
-              </w:rPr>
-              <w:t>2</w:t>
+              <w:t>м</w:t>
             </w:r>
           </w:p>
         </w:tc>
@@ -12702,7 +12551,6 @@
                 <w:color w:val="000000"/>
               </w:rPr>
             </w:pPr>
-            <w:proofErr w:type="spellStart"/>
             <w:r>
               <w:rPr>
                 <w:color w:val="000000"/>
@@ -12714,43 +12562,13 @@
                 <w:color w:val="000000"/>
                 <w:vertAlign w:val="subscript"/>
               </w:rPr>
-              <w:t>пр</w:t>
-            </w:r>
-            <w:proofErr w:type="spellEnd"/>
-            <w:r>
-              <w:rPr>
-                <w:color w:val="000000"/>
-                <w:vertAlign w:val="subscript"/>
-              </w:rPr>
-              <w:t xml:space="preserve"> </w:t>
-            </w:r>
-            <w:proofErr w:type="spellStart"/>
-            <w:r>
-              <w:rPr>
-                <w:color w:val="000000"/>
-                <w:vertAlign w:val="subscript"/>
-              </w:rPr>
-              <w:t>теор</w:t>
-            </w:r>
-            <w:proofErr w:type="spellEnd"/>
-            <w:r>
-              <w:rPr>
-                <w:color w:val="000000"/>
-              </w:rPr>
-              <w:t xml:space="preserve">, </w:t>
-            </w:r>
-            <w:r>
-              <w:rPr>
-                <w:color w:val="000000"/>
-              </w:rPr>
-              <w:t>кг/м</w:t>
-            </w:r>
-            <w:r>
-              <w:rPr>
-                <w:color w:val="000000"/>
-                <w:vertAlign w:val="superscript"/>
-              </w:rPr>
-              <w:t>2</w:t>
+              <w:t>пр теор</w:t>
+            </w:r>
+            <w:r>
+              <w:rPr>
+                <w:color w:val="000000"/>
+              </w:rPr>
+              <w:t>, м</w:t>
             </w:r>
           </w:p>
         </w:tc>
@@ -13152,67 +12970,28 @@
         <w:rPr>
           <w:color w:val="000000"/>
         </w:rPr>
-        <w:t xml:space="preserve">Кроме того, были определены экспериментальные </w:t>
-      </w:r>
-      <w:proofErr w:type="spellStart"/>
-      <w:r>
-        <w:rPr>
-          <w:color w:val="000000"/>
-        </w:rPr>
-        <w:t>l</w:t>
+        <w:t>Кроме того, были определены экспериментальные l</w:t>
       </w:r>
       <w:r>
         <w:rPr>
           <w:color w:val="000000"/>
           <w:vertAlign w:val="subscript"/>
         </w:rPr>
-        <w:t>пр</w:t>
-      </w:r>
-      <w:proofErr w:type="spellEnd"/>
+        <w:t>пр эксп</w:t>
+      </w:r>
+      <w:r>
+        <w:rPr>
+          <w:color w:val="000000"/>
+        </w:rPr>
+        <w:t xml:space="preserve"> и теоретические l</w:t>
+      </w:r>
       <w:r>
         <w:rPr>
           <w:color w:val="000000"/>
           <w:vertAlign w:val="subscript"/>
         </w:rPr>
-        <w:t xml:space="preserve"> эксп</w:t>
-      </w:r>
-      <w:r>
-        <w:rPr>
-          <w:color w:val="000000"/>
-        </w:rPr>
-        <w:t xml:space="preserve"> и теоретические </w:t>
-      </w:r>
-      <w:proofErr w:type="spellStart"/>
-      <w:r>
-        <w:rPr>
-          <w:color w:val="000000"/>
-        </w:rPr>
-        <w:t>l</w:t>
-      </w:r>
-      <w:r>
-        <w:rPr>
-          <w:color w:val="000000"/>
-          <w:vertAlign w:val="subscript"/>
-        </w:rPr>
-        <w:t>пр</w:t>
-      </w:r>
-      <w:proofErr w:type="spellEnd"/>
-      <w:r>
-        <w:rPr>
-          <w:color w:val="000000"/>
-          <w:vertAlign w:val="subscript"/>
-        </w:rPr>
-        <w:t xml:space="preserve"> </w:t>
-      </w:r>
-      <w:proofErr w:type="spellStart"/>
-      <w:r>
-        <w:rPr>
-          <w:color w:val="000000"/>
-          <w:vertAlign w:val="subscript"/>
-        </w:rPr>
-        <w:t>теор</w:t>
-      </w:r>
-      <w:proofErr w:type="spellEnd"/>
+        <w:t>пр теор</w:t>
+      </w:r>
       <w:r>
         <w:rPr>
           <w:color w:val="000000"/>
@@ -13383,7 +13162,7 @@
               <v:stroke joinstyle="miter"/>
               <v:path gradientshapeok="t" o:connecttype="rect"/>
             </v:shapetype>
-            <v:shape id="Надпись 16" o:spid="_x0000_s1026" type="#_x0000_t202" style="position:absolute;margin-left:63.35pt;margin-top:35.2pt;width:170.05pt;height:15.45pt;z-index:-251658240;visibility:visible;mso-wrap-style:square;mso-width-percent:0;mso-height-percent:0;mso-wrap-distance-left:9pt;mso-wrap-distance-top:0;mso-wrap-distance-right:9pt;mso-wrap-distance-bottom:0;mso-position-horizontal:absolute;mso-position-horizontal-relative:page;mso-position-vertical:absolute;mso-position-vertical-relative:page;mso-width-percent:0;mso-height-percent:0;mso-width-relative:page;mso-height-relative:page;v-text-anchor:top" o:gfxdata="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" filled="f" stroked="f">
+            <v:shape id="Надпись 16" o:spid="_x0000_s1026" type="#_x0000_t202" style="position:absolute;margin-left:63.35pt;margin-top:35.2pt;width:170.05pt;height:15.45pt;z-index:-251658240;visibility:visible;mso-wrap-style:square;mso-width-percent:0;mso-height-percent:0;mso-wrap-distance-left:9pt;mso-wrap-distance-top:0;mso-wrap-distance-right:9pt;mso-wrap-distance-bottom:0;mso-position-horizontal:absolute;mso-position-horizontal-relative:page;mso-position-vertical:absolute;mso-position-vertical-relative:page;mso-width-percent:0;mso-height-percent:0;mso-width-relative:page;mso-height-relative:page;v-text-anchor:top" o:gfxdata="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" filled="f" stroked="f">
               <v:textbox inset="0,0,0,0">
                 <w:txbxContent>
                   <w:p>
@@ -17375,7 +17154,17 @@
                 </a:r>
                 <a:r>
                   <a:rPr lang="ru-RU" baseline="0"/>
-                  <a:t>кг/м</a:t>
+                  <a:t>кг</a:t>
+                </a:r>
+                <a:r>
+                  <a:rPr lang="ru-RU" sz="900" b="1" i="0" u="none" strike="noStrike" baseline="0">
+                    <a:effectLst/>
+                  </a:rPr>
+                  <a:t>⋅</a:t>
+                </a:r>
+                <a:r>
+                  <a:rPr lang="ru-RU" baseline="0"/>
+                  <a:t>м</a:t>
                 </a:r>
                 <a:r>
                   <a:rPr lang="ru-RU" baseline="30000"/>

</xml_diff>